<commit_message>
Make the document references accurate on both branches
The overview document and the sample-data file are shared by both
versions, so anything they point at has to resolve on either branch.

Three references did not: the migration plan exists only on
react-and-rest-version, seed_data_reference.md sits under backend/ there
but exhibit_guide_pwa/ on main, and the React staff screen at
/manage/new has no equivalent on main.

Each now says which branch it applies to rather than assuming this one.

Co-Authored-By: Claude Opus 5 <noreply@anthropic.com>
</commit_message>
<xml_diff>
--- a/READ_FIRST_ExhibitGuide-Project-Overview.docx
+++ b/READ_FIRST_ExhibitGuide-Project-Overview.docx
@@ -1735,7 +1735,7 @@
       <w:pPr>
         <w:spacing w:after="120" w:line="300"/>
       </w:pPr>
-      <w:hyperlink w:history="1" r:id="rId5hof6034tmyiwodppyji9">
+      <w:hyperlink w:history="1" r:id="rIdx58245ugomt2zya6ujoqb">
         <w:r>
           <w:rPr>
             <w:color w:val="1155CC"/>
@@ -4384,7 +4384,7 @@
         </w:rPr>
         <w:t xml:space="preserve">A React application implementing five designed screens, with client-side routing and a custom CSS design system. </w:t>
       </w:r>
-      <w:hyperlink w:history="1" r:id="rIdz8cdaxvwbphoxvujggmf7">
+      <w:hyperlink w:history="1" r:id="rIddafgphlhwiujglvhoqo2h">
         <w:r>
           <w:rPr>
             <w:color w:val="1155CC"/>
@@ -4512,7 +4512,7 @@
       <w:pPr>
         <w:spacing w:after="120" w:line="300"/>
       </w:pPr>
-      <w:hyperlink w:history="1" r:id="rIdnuup9ihrvlqe-3yoseig5">
+      <w:hyperlink w:history="1" r:id="rId_ef4mdqk-6ktgximnmu_7">
         <w:r>
           <w:rPr>
             <w:color w:val="1155CC"/>
@@ -5598,7 +5598,7 @@
       <w:pPr>
         <w:spacing w:after="120" w:line="300"/>
       </w:pPr>
-      <w:hyperlink w:history="1" r:id="rIdfzasgcm7jzozjegipfswz">
+      <w:hyperlink w:history="1" r:id="rIdzxrmvah-ltg0irbf07s0m">
         <w:r>
           <w:rPr>
             <w:color w:val="1155CC"/>
@@ -5648,7 +5648,7 @@
       <w:pPr>
         <w:spacing w:after="120" w:line="300"/>
       </w:pPr>
-      <w:hyperlink w:history="1" r:id="rIdih9r6xl7ob6a8oz3gni2o">
+      <w:hyperlink w:history="1" r:id="rIdeceggcykvmbyknyk_xghn">
         <w:r>
           <w:rPr>
             <w:color w:val="1155CC"/>
@@ -5685,7 +5685,7 @@
       <w:pPr>
         <w:spacing w:after="120" w:line="300"/>
       </w:pPr>
-      <w:hyperlink w:history="1" r:id="rIdpvepvls5dkp-bfmcfyosx">
+      <w:hyperlink w:history="1" r:id="rId1cyyy5o0gt_sr5yc8xmee">
         <w:r>
           <w:rPr>
             <w:color w:val="1155CC"/>
@@ -5701,7 +5701,7 @@
       <w:pPr>
         <w:spacing w:after="120" w:line="300"/>
       </w:pPr>
-      <w:hyperlink w:history="1" r:id="rId2pd7e1ky_l0nrdqrugaem">
+      <w:hyperlink w:history="1" r:id="rIdbt819jiowi2oba55dbcbi">
         <w:r>
           <w:rPr>
             <w:color w:val="1155CC"/>
@@ -5717,7 +5717,7 @@
       <w:pPr>
         <w:spacing w:after="120" w:line="300"/>
       </w:pPr>
-      <w:hyperlink w:history="1" r:id="rIdley5crjr8uqwbruybmwke">
+      <w:hyperlink w:history="1" r:id="rIdtb7nzfhghfv8kz5r38lwd">
         <w:r>
           <w:rPr>
             <w:color w:val="1155CC"/>
@@ -5733,7 +5733,7 @@
       <w:pPr>
         <w:spacing w:after="120" w:line="300"/>
       </w:pPr>
-      <w:hyperlink w:history="1" r:id="rIdwqhvy23sadd6yfpvxuma2">
+      <w:hyperlink w:history="1" r:id="rIdgj6puu2fzullk8zgjpekc">
         <w:r>
           <w:rPr>
             <w:color w:val="1155CC"/>
@@ -6131,7 +6131,27 @@
           <w:sz w:val="22"/>
           <w:szCs w:val="22"/>
         </w:rPr>
-        <w:t xml:space="preserve"> — the ten-phase record of the migration from the Django monolith to the React and REST architecture.</w:t>
+        <w:t xml:space="preserve"> — the ten-phase record of the migration from the Django monolith to the React and REST architecture. Held on the </w:t>
+      </w:r>
+      <w:r>
+        <w:rPr>
+          <w:b w:val="false"/>
+          <w:bCs w:val="false"/>
+          <w:i/>
+          <w:iCs/>
+          <w:color w:val="1C1917"/>
+          <w:sz w:val="22"/>
+          <w:szCs w:val="22"/>
+        </w:rPr>
+        <w:t xml:space="preserve">react-and-rest-version</w:t>
+      </w:r>
+      <w:r>
+        <w:rPr>
+          <w:color w:val="1C1917"/>
+          <w:sz w:val="22"/>
+          <w:szCs w:val="22"/>
+        </w:rPr>
+        <w:t xml:space="preserve"> branch, since that is the work it describes.</w:t>
       </w:r>
     </w:p>
     <w:p>
@@ -6183,15 +6203,55 @@
           <w:sz w:val="22"/>
           <w:szCs w:val="22"/>
         </w:rPr>
-        <w:t xml:space="preserve">backend/exhibits/management/commands/seed_data_reference.md</w:t>
-      </w:r>
-      <w:r>
-        <w:rPr>
-          <w:color w:val="1C1917"/>
-          <w:sz w:val="22"/>
-          <w:szCs w:val="22"/>
-        </w:rPr>
-        <w:t xml:space="preserve"> — a field-by-field reference for the ten seeded artworks, for re-entering or checking existing content.</w:t>
+        <w:t xml:space="preserve">exhibits/management/commands/seed_data_reference.md</w:t>
+      </w:r>
+      <w:r>
+        <w:rPr>
+          <w:color w:val="1C1917"/>
+          <w:sz w:val="22"/>
+          <w:szCs w:val="22"/>
+        </w:rPr>
+        <w:t xml:space="preserve"> — a field-by-field reference for the ten seeded artworks, for re-entering or checking existing content. Found under </w:t>
+      </w:r>
+      <w:r>
+        <w:rPr>
+          <w:b w:val="false"/>
+          <w:bCs w:val="false"/>
+          <w:i/>
+          <w:iCs/>
+          <w:color w:val="1C1917"/>
+          <w:sz w:val="22"/>
+          <w:szCs w:val="22"/>
+        </w:rPr>
+        <w:t xml:space="preserve">backend/</w:t>
+      </w:r>
+      <w:r>
+        <w:rPr>
+          <w:color w:val="1C1917"/>
+          <w:sz w:val="22"/>
+          <w:szCs w:val="22"/>
+        </w:rPr>
+        <w:t xml:space="preserve"> on the React branch and </w:t>
+      </w:r>
+      <w:r>
+        <w:rPr>
+          <w:b w:val="false"/>
+          <w:bCs w:val="false"/>
+          <w:i/>
+          <w:iCs/>
+          <w:color w:val="1C1917"/>
+          <w:sz w:val="22"/>
+          <w:szCs w:val="22"/>
+        </w:rPr>
+        <w:t xml:space="preserve">exhibit_guide_pwa/</w:t>
+      </w:r>
+      <w:r>
+        <w:rPr>
+          <w:color w:val="1C1917"/>
+          <w:sz w:val="22"/>
+          <w:szCs w:val="22"/>
+        </w:rPr>
+        <w:t xml:space="preserve"> on main.</w:t>
       </w:r>
     </w:p>
     <w:sectPr>

</xml_diff>